<commit_message>
Mirror: lessons, aligned quizzes, 90-day check-in, code-rotation docs
Co-Authored-By: Claude Sonnet 5.5 <noreply@anthropic.com>
Claude-Session: https://claude.ai/code/session_01PoYyMUmC9FKTvnKEPi4JtD
</commit_message>
<xml_diff>
--- a/culinary-coach-lms/docs/LMS_PreDeploy_Checklist_updated.docx
+++ b/culinary-coach-lms/docs/LMS_PreDeploy_Checklist_updated.docx
@@ -399,7 +399,7 @@
                 <w:sz w:val="20"/>
                 <w:szCs w:val="20"/>
               </w:rPr>
-              <w:t xml:space="preserve">Login with each real student code (CE2026A-H)</w:t>
+              <w:t>Login with each real student code (from the instructor's private list — never written in the repo)</w:t>
             </w:r>
           </w:p>
         </w:tc>
@@ -517,7 +517,7 @@
                 <w:sz w:val="20"/>
                 <w:szCs w:val="20"/>
               </w:rPr>
-              <w:t xml:space="preserve">Login with ADMIN2026</w:t>
+              <w:t>Login with the instructor code (private list); confirm the old CE2026/ADMIN2026 codes are rejected</w:t>
             </w:r>
           </w:p>
         </w:tc>

</xml_diff>